<commit_message>
Lab 7 done, 6 fixed report
</commit_message>
<xml_diff>
--- a/tp/lab-6/ПРИ123-ТП-#06-Нямаа.docx
+++ b/tp/lab-6/ПРИ123-ТП-#06-Нямаа.docx
@@ -2008,14 +2008,7 @@
           <w:sz w:val="28"/>
           <w:lang w:val="en-US"/>
         </w:rPr>
-        <w:t>ConfigurationController</w:t>
-      </w:r>
-      <w:r>
-        <w:rPr>
-          <w:sz w:val="28"/>
-          <w:lang w:val="en-US"/>
-        </w:rPr>
-        <w:t>.cs</w:t>
+        <w:t>ConfigurationController.cs</w:t>
       </w:r>
       <w:r>
         <w:rPr>
@@ -3853,6 +3846,7 @@
       </w:pPr>
       <w:r>
         <w:rPr>
+          <w:noProof/>
           <w:sz w:val="28"/>
           <w:szCs w:val="28"/>
         </w:rPr>
@@ -3953,13 +3947,7 @@
         <w:rPr>
           <w:sz w:val="28"/>
         </w:rPr>
-        <w:t>2</w:t>
-      </w:r>
-      <w:r>
-        <w:rPr>
-          <w:sz w:val="28"/>
-        </w:rPr>
-        <w:t xml:space="preserve"> (вариант 14).</w:t>
+        <w:t>2 (вариант 14).</w:t>
       </w:r>
     </w:p>
     <w:p>
@@ -4769,45 +4757,20 @@
         <w:rPr>
           <w:sz w:val="28"/>
         </w:rPr>
-        <w:t>Листинг</w:t>
-      </w:r>
-      <w:r>
-        <w:rPr>
-          <w:sz w:val="28"/>
-        </w:rPr>
-        <w:t xml:space="preserve"> .</w:t>
-      </w:r>
-      <w:r>
-        <w:rPr>
-          <w:sz w:val="28"/>
-          <w:lang w:val="en-US"/>
-        </w:rPr>
-        <w:t>csproj</w:t>
-      </w:r>
-      <w:r>
-        <w:rPr>
-          <w:sz w:val="28"/>
-          <w:lang w:val="en-US"/>
-        </w:rPr>
-        <w:t xml:space="preserve"> </w:t>
-      </w:r>
-      <w:r>
-        <w:rPr>
-          <w:sz w:val="28"/>
-        </w:rPr>
-        <w:t>(</w:t>
-      </w:r>
-      <w:r>
-        <w:rPr>
-          <w:sz w:val="28"/>
-        </w:rPr>
-        <w:t>основной проект</w:t>
-      </w:r>
-      <w:r>
-        <w:rPr>
-          <w:sz w:val="28"/>
-        </w:rPr>
-        <w:t>):</w:t>
+        <w:t>Листинг .</w:t>
+      </w:r>
+      <w:r>
+        <w:rPr>
+          <w:sz w:val="28"/>
+          <w:lang w:val="en-US"/>
+        </w:rPr>
+        <w:t xml:space="preserve">csproj </w:t>
+      </w:r>
+      <w:r>
+        <w:rPr>
+          <w:sz w:val="28"/>
+        </w:rPr>
+        <w:t>(основной проект):</w:t>
       </w:r>
     </w:p>
     <w:p>
@@ -5458,56 +5421,13 @@
           <w:sz w:val="28"/>
           <w:lang w:val="en-US"/>
         </w:rPr>
-        <w:t>ConfigurationController</w:t>
-      </w:r>
-      <w:r>
-        <w:rPr>
-          <w:sz w:val="28"/>
-          <w:lang w:val="en-US"/>
-        </w:rPr>
-        <w:t xml:space="preserve"> </w:t>
-      </w:r>
-      <w:r>
-        <w:rPr>
-          <w:sz w:val="28"/>
-        </w:rPr>
-        <w:t>(</w:t>
-      </w:r>
-      <w:r>
-        <w:rPr>
-          <w:sz w:val="28"/>
-        </w:rPr>
-        <w:t xml:space="preserve">функционал </w:t>
-      </w:r>
-      <w:r>
-        <w:rPr>
-          <w:sz w:val="28"/>
-        </w:rPr>
-        <w:t>основн</w:t>
-      </w:r>
-      <w:r>
-        <w:rPr>
-          <w:sz w:val="28"/>
-        </w:rPr>
-        <w:t>ого</w:t>
-      </w:r>
-      <w:r>
-        <w:rPr>
-          <w:sz w:val="28"/>
-        </w:rPr>
-        <w:t xml:space="preserve"> проект</w:t>
-      </w:r>
-      <w:r>
-        <w:rPr>
-          <w:sz w:val="28"/>
-        </w:rPr>
-        <w:t>а</w:t>
-      </w:r>
-      <w:r>
-        <w:rPr>
-          <w:sz w:val="28"/>
-        </w:rPr>
-        <w:t>):</w:t>
+        <w:t xml:space="preserve">ConfigurationController </w:t>
+      </w:r>
+      <w:r>
+        <w:rPr>
+          <w:sz w:val="28"/>
+        </w:rPr>
+        <w:t>(функционал основного проекта):</w:t>
       </w:r>
     </w:p>
     <w:p>
@@ -7515,6 +7435,7 @@
       </w:pPr>
       <w:r>
         <w:rPr>
+          <w:noProof/>
           <w:sz w:val="28"/>
           <w:szCs w:val="28"/>
         </w:rPr>
@@ -7619,6 +7540,7 @@
       </w:pPr>
       <w:r>
         <w:rPr>
+          <w:noProof/>
           <w:sz w:val="28"/>
           <w:szCs w:val="28"/>
         </w:rPr>
@@ -7674,14 +7596,21 @@
           <w:sz w:val="28"/>
           <w:szCs w:val="28"/>
         </w:rPr>
-        <w:t xml:space="preserve">Рисунок 2. </w:t>
+        <w:t xml:space="preserve">Рисунок </w:t>
       </w:r>
       <w:r>
         <w:rPr>
           <w:sz w:val="28"/>
           <w:szCs w:val="28"/>
         </w:rPr>
-        <w:t>Пример вывода логов.</w:t>
+        <w:t>3</w:t>
+      </w:r>
+      <w:r>
+        <w:rPr>
+          <w:sz w:val="28"/>
+          <w:szCs w:val="28"/>
+        </w:rPr>
+        <w:t>. Пример вывода логов.</w:t>
       </w:r>
     </w:p>
     <w:p>
@@ -8451,6 +8380,7 @@
   <w:style w:type="character" w:default="1" w:styleId="a0">
     <w:name w:val="Default Paragraph Font"/>
     <w:uiPriority w:val="1"/>
+    <w:semiHidden/>
     <w:unhideWhenUsed/>
   </w:style>
   <w:style w:type="table" w:default="1" w:styleId="a1">

</xml_diff>